<commit_message>
WIP: cost script update (standoff sets, T5 edge bracket); plate-size and ramp follow-ups in progress (agent snapshot)
Co-Authored-By: Claude Fable 5.1 <noreply@anthropic.com>
Claude-Session: https://claude.ai/code/session_01ERsPi9xhFu3U1nLCkBXPjN
</commit_message>
<xml_diff>
--- a/docs/procedures/Review/baselines/2026-10-08_02/performance_test_procedure.docx
+++ b/docs/procedures/Review/baselines/2026-10-08_02/performance_test_procedure.docx
@@ -845,7 +845,7 @@
       <w:r>
         <w:drawing>
           <wp:inline>
-            <wp:extent cx="5334000" cy="3620965"/>
+            <wp:extent cx="5334000" cy="3698923"/>
             <wp:effectExtent b="0" l="0" r="0" t="0"/>
             <wp:docPr descr="" title="" id="17" name="Picture"/>
             <a:graphic>
@@ -866,7 +866,7 @@
                   <pic:spPr bwMode="auto">
                     <a:xfrm>
                       <a:off x="0" y="0"/>
-                      <a:ext cx="5334000" cy="3620965"/>
+                      <a:ext cx="5334000" cy="3698923"/>
                     </a:xfrm>
                     <a:prstGeom prst="rect">
                       <a:avLst/>
@@ -2762,7 +2762,7 @@
         <w:t xml:space="preserve">MOUNT_TILT_TOLERANCE_DEG</w:t>
       </w:r>
       <w:r>
-        <w:t xml:space="preserve">, a dagger parameter: 0.05 degrees moves a plate edge 200 mm from the center by about 0.17 mm);</w:t>
+        <w:t xml:space="preserve">, a dagger parameter: 0.05 degrees moves a plate edge 100 mm from the center by about 0.09 mm);</w:t>
       </w:r>
     </w:p>
     <w:p>
@@ -4986,7 +4986,7 @@
         <w:t xml:space="preserve">tilt</w:t>
       </w:r>
       <w:r>
-        <w:t xml:space="preserve">. A tilt is planned only where the tilted plate’s near edge stays at or beyond Z_MIN: the near edge is at Z minus half the plate width times the sine of the tilt. The planner checks this, leaves out the poses that fail, and lists them under</w:t>
+        <w:t xml:space="preserve">. A tilt is planned only where the tilted plate’s near edge stays at or beyond Z_MIN: the near edge is at Z minus half the plate’s extent across the tilt axis times the sine of the tilt (75 mm for tilts about H, 100 mm for tilts about V, with the 200 x 150 mm board). The planner checks this, leaves out the poses that fail, and lists them under</w:t>
       </w:r>
       <w:r>
         <w:t xml:space="preserve"> </w:t>
@@ -5010,7 +5010,7 @@
         <w:t xml:space="preserve">plan_summary.txt</w:t>
       </w:r>
       <w:r>
-        <w:t xml:space="preserve">. With the 200, 150 mm plate (width, height) that rules out every tilt at 400 mm, so the tilt sub-series runs at 800 and 1600 mm. Do not add tilts at the skipped stations by hand.</w:t>
+        <w:t xml:space="preserve">. With the 200, 150 mm plate (width, height) that rules out every tilt at 400 mm, so the tilt sub-series runs at 476, 800 and 1600 mm. Do not add tilts at the skipped stations by hand.</w:t>
       </w:r>
     </w:p>
     <w:p>
@@ -5588,7 +5588,7 @@
         </w:numPr>
       </w:pPr>
       <w:r>
-        <w:t xml:space="preserve">Ramp. At every station of the ladder, T2 is centered and tilted about H (the horizontal axis, parallel to the stereo baseline) by a small angle, so that the true depth across the visible height of the plate spans 2 expected quanta (</w:t>
+        <w:t xml:space="preserve">Ramp. At every station of the ladder, T2 is centered and tilted about H (the horizontal axis, parallel to the stereo baseline) by a small angle, so that the true depth across the visible height of the plate spans 3 expected quanta (</w:t>
       </w:r>
       <w:r>
         <w:rPr>
@@ -5606,7 +5606,7 @@
         <w:t xml:space="preserve">tilt_deg</w:t>
       </w:r>
       <w:r>
-        <w:t xml:space="preserve">) and is 0.3 degrees at the nearest station to 4.7 degrees at the farthest. The flange pose in the row already includes it. Capture 50 frames (</w:t>
+        <w:t xml:space="preserve">) and is 0.4 degrees at the nearest station to 7.1 degrees at the farthest. The flange pose in the row already includes it. Capture 50 frames (</w:t>
       </w:r>
       <w:r>
         <w:rPr>
@@ -5627,7 +5627,7 @@
         <w:t xml:space="preserve">ramp</w:t>
       </w:r>
       <w:r>
-        <w:t xml:space="preserve">). One capture per station replaces a staircase of small Z moves and does not depend on the robot resolving them. At 400 mm the tilted plate’s near edge would come 0.39 mm closer than Z_MIN, so the planner moves the plate center 0.39 mm farther. The station label stays at that station, and the shift is in the row’s</w:t>
+        <w:t xml:space="preserve">). One capture per station replaces a staircase of small Z moves and does not depend on the robot resolving them. At 400 mm the tilted plate’s near edge would come 0.58 mm closer than Z_MIN, so the planner moves the plate center 0.58 mm farther. The station label stays at that station, and the shift is in the row’s</w:t>
       </w:r>
       <w:r>
         <w:t xml:space="preserve"> </w:t>
@@ -8645,7 +8645,7 @@
               <w:jc w:val="right"/>
             </w:pPr>
             <w:r>
-              <w:t xml:space="preserve">64</w:t>
+              <w:t xml:space="preserve">72</w:t>
             </w:r>
           </w:p>
         </w:tc>
@@ -8657,7 +8657,7 @@
               <w:jc w:val="right"/>
             </w:pPr>
             <w:r>
-              <w:t xml:space="preserve">5,600</w:t>
+              <w:t xml:space="preserve">6,000</w:t>
             </w:r>
           </w:p>
         </w:tc>
@@ -8669,7 +8669,7 @@
               <w:jc w:val="right"/>
             </w:pPr>
             <w:r>
-              <w:t xml:space="preserve">0.21</w:t>
+              <w:t xml:space="preserve">0.23</w:t>
             </w:r>
           </w:p>
         </w:tc>
@@ -8996,7 +8996,7 @@
                 <w:b/>
                 <w:bCs/>
               </w:rPr>
-              <w:t xml:space="preserve">7,194</w:t>
+              <w:t xml:space="preserve">7,202</w:t>
             </w:r>
           </w:p>
         </w:tc>
@@ -9012,7 +9012,7 @@
                 <w:b/>
                 <w:bCs/>
               </w:rPr>
-              <w:t xml:space="preserve">42,520</w:t>
+              <w:t xml:space="preserve">42,920</w:t>
             </w:r>
           </w:p>
         </w:tc>
@@ -9047,7 +9047,7 @@
         <w:pStyle w:val="BodyText"/>
       </w:pPr>
       <w:r>
-        <w:t xml:space="preserve">The plan has 7,194 poses and 42,520 frames, about 7.2 hours of robot time. The extended 5 percent series takes about a third of the robot time. Check storage before starting: multiply the size of one</w:t>
+        <w:t xml:space="preserve">The plan has 7,202 poses and 42,920 frames, about 7.2 hours of robot time. The extended 5 percent series takes about a third of the robot time. Check storage before starting: multiply the size of one</w:t>
       </w:r>
       <w:r>
         <w:t xml:space="preserve"> </w:t>
@@ -9062,7 +9062,7 @@
         <w:t xml:space="preserve"> </w:t>
       </w:r>
       <w:r>
-        <w:t xml:space="preserve">frame by 42,520 frames.</w:t>
+        <w:t xml:space="preserve">frame by 42,920 frames.</w:t>
       </w:r>
     </w:p>
     <w:p>
@@ -9082,7 +9082,7 @@
         </w:numPr>
       </w:pPr>
       <w:r>
-        <w:t xml:space="preserve">the filters-off repeat of A, B-HV, and B-Z (Step 4.2): 1,030 poses, 25,990 frames, about 1.6 hours;</w:t>
+        <w:t xml:space="preserve">the filters-off repeat of A, B-HV, and B-Z (Step 4.2): 1,038 poses, 26,390 frames, about 1.6 hours;</w:t>
       </w:r>
     </w:p>
     <w:p>
@@ -11852,7 +11852,7 @@
         <w:t xml:space="preserve"> </w:t>
       </w:r>
       <w:r>
-        <w:t xml:space="preserve">of the mount check (Step 4.8) is in the table with its suggested value and also carries the dagger: 0.05 degrees moves a plate edge 200 mm from the center by about 0.17 mm. Where this document quotes a number that depends on the dagger values (the feature diameters, the field fit, the budget), it uses indicative values for a 640 by 480 sensor and says so. These are not datasheet values.</w:t>
+        <w:t xml:space="preserve">of the mount check (Step 4.8) is in the table with its suggested value and also carries the dagger: 0.05 degrees moves a plate edge 100 mm from the center by about 0.09 mm. Where this document quotes a number that depends on the dagger values (the feature diameters, the field fit, the budget), it uses indicative values for a 640 by 480 sensor and says so. These are not datasheet values.</w:t>
       </w:r>
     </w:p>
     <w:tbl>
@@ -13511,18 +13511,27 @@
               <w:pStyle w:val="Compact"/>
             </w:pPr>
             <w:r>
-              <w:t xml:space="preserve">2</w:t>
-            </w:r>
-          </w:p>
-        </w:tc>
-        <w:tc>
-          <w:tcPr/>
-          <w:p>
-            <w:pPr>
-              <w:pStyle w:val="Compact"/>
-            </w:pPr>
-            <w:r>
-              <w:t xml:space="preserve">The B-Z ramp tilts the plate about H so that the true depth across the plate’s VISIBLE height (the smaller of the plate height and the field height at that Z) spans this many expected depth quanta (Section 6.2). With the 150 mm high stage-1 calibration board (T2) the visible height is the board height from about 380 mm on, so 2 quanta across it give about 32 image rows per quantum at 1600 mm at the indicative geometry, and more at the nearer stations.</w:t>
+              <w:t xml:space="preserve">3</w:t>
+            </w:r>
+          </w:p>
+        </w:tc>
+        <w:tc>
+          <w:tcPr/>
+          <w:p>
+            <w:pPr>
+              <w:pStyle w:val="Compact"/>
+            </w:pPr>
+            <w:r>
+              <w:t xml:space="preserve">The B-Z ramp tilts the plate about H so that the true depth across the plate’s VISIBLE height (the smaller of the plate height and the field height at that Z) spans this many expected depth quanta (Section 6.2). The analysis region loses the boundary band (</w:t>
+            </w:r>
+            <w:r>
+              <w:rPr>
+                <w:rStyle w:val="VerbatimChar"/>
+              </w:rPr>
+              <w:t xml:space="preserve">boundary_band_half_width_px</w:t>
+            </w:r>
+            <w:r>
+              <w:t xml:space="preserve">, 8 px) on each side, so with the 150 mm high stage-1 board (64.5 rows at 1600 mm) it keeps about 0.75 of the visible height: 2 quanta would leave only about 1.5 inside the region and no guaranteed complete plateau, whereas 3 quanta leave about 2.3, so that at least one plateau lies completely between two steps at every station (the plateau method needs two steps in the region). At the indicative geometry that is about 21 image rows per quantum at 1600 mm (150 mm x fy / 1600 mm / 3), and more at the nearer stations.</w:t>
             </w:r>
           </w:p>
         </w:tc>
@@ -15145,18 +15154,57 @@
               <w:pStyle w:val="Compact"/>
             </w:pPr>
             <w:r>
-              <w:t xml:space="preserve">400, 400</w:t>
-            </w:r>
-          </w:p>
-        </w:tc>
-        <w:tc>
-          <w:tcPr/>
-          <w:p>
-            <w:pPr>
-              <w:pStyle w:val="Compact"/>
-            </w:pPr>
-            <w:r>
-              <w:t xml:space="preserve">Back plate of T3a and front plate of T3b, width x height, mm. These plates carry a 160 mm square and must extend past it by the boundary band plus the shadow, so they do NOT follow the smaller T2 board: they keep the 400 x 400 mm size that the noise plate had when the edge targets were defined.</w:t>
+              <w:t xml:space="preserve">None</w:t>
+            </w:r>
+          </w:p>
+        </w:tc>
+        <w:tc>
+          <w:tcPr/>
+          <w:p>
+            <w:pPr>
+              <w:pStyle w:val="Compact"/>
+            </w:pPr>
+            <w:r>
+              <w:t xml:space="preserve">Override of the back plate of T3a and the front plate of T3b, width x height, mm.</w:t>
+            </w:r>
+            <w:r>
+              <w:t xml:space="preserve"> </w:t>
+            </w:r>
+            <w:r>
+              <w:rPr>
+                <w:rStyle w:val="VerbatimChar"/>
+              </w:rPr>
+              <w:t xml:space="preserve">None</w:t>
+            </w:r>
+            <w:r>
+              <w:t xml:space="preserve"> </w:t>
+            </w:r>
+            <w:r>
+              <w:t xml:space="preserve">(the default) derives the size from the rule of</w:t>
+            </w:r>
+            <w:r>
+              <w:t xml:space="preserve"> </w:t>
+            </w:r>
+            <w:r>
+              <w:rPr>
+                <w:rStyle w:val="VerbatimChar"/>
+              </w:rPr>
+              <w:t xml:space="preserve">geometry.targets.edge_plate_sizing</w:t>
+            </w:r>
+            <w:r>
+              <w:t xml:space="preserve">: the plate extends past the square by the larger of (a) the boundary band at Z_MAX plus the shadow of the large gap (GAP_LARGE_MM times the tangent of the worst ray angle over the poses used) and (b) the feature isolation at Z_MAX (the T3b front plate needs it around its window), and the side is rounded up to</w:t>
+            </w:r>
+            <w:r>
+              <w:t xml:space="preserve"> </w:t>
+            </w:r>
+            <w:r>
+              <w:rPr>
+                <w:rStyle w:val="VerbatimChar"/>
+              </w:rPr>
+              <w:t xml:space="preserve">edge_plate_size_step_mm</w:t>
+            </w:r>
+            <w:r>
+              <w:t xml:space="preserve">. These plates do NOT follow the smaller T2 board.</w:t>
             </w:r>
           </w:p>
         </w:tc>
@@ -15172,29 +15220,29 @@
               <w:rPr>
                 <w:rStyle w:val="VerbatimChar"/>
               </w:rPr>
-              <w:t xml:space="preserve">PLATE_FLATNESS_MM</w:t>
-            </w:r>
-          </w:p>
-        </w:tc>
-        <w:tc>
-          <w:tcPr/>
-          <w:p>
-            <w:pPr>
-              <w:pStyle w:val="Compact"/>
-            </w:pPr>
-            <w:r>
-              <w:t xml:space="preserve">0.05</w:t>
-            </w:r>
-          </w:p>
-        </w:tc>
-        <w:tc>
-          <w:tcPr/>
-          <w:p>
-            <w:pPr>
-              <w:pStyle w:val="Compact"/>
-            </w:pPr>
-            <w:r>
-              <w:t xml:space="preserve">Required flatness of every plate.</w:t>
+              <w:t xml:space="preserve">EDGE_PLATE_SIZE_STEP_MM</w:t>
+            </w:r>
+          </w:p>
+        </w:tc>
+        <w:tc>
+          <w:tcPr/>
+          <w:p>
+            <w:pPr>
+              <w:pStyle w:val="Compact"/>
+            </w:pPr>
+            <w:r>
+              <w:t xml:space="preserve">10</w:t>
+            </w:r>
+          </w:p>
+        </w:tc>
+        <w:tc>
+          <w:tcPr/>
+          <w:p>
+            <w:pPr>
+              <w:pStyle w:val="Compact"/>
+            </w:pPr>
+            <w:r>
+              <w:t xml:space="preserve">The derived side of the T3a and T3b plates is rounded up to a multiple of this (a plate is cut to a round size).</w:t>
             </w:r>
           </w:p>
         </w:tc>
@@ -15210,29 +15258,29 @@
               <w:rPr>
                 <w:rStyle w:val="VerbatimChar"/>
               </w:rPr>
-              <w:t xml:space="preserve">PLATE_FLATNESS_SIGMA_FRACTION</w:t>
-            </w:r>
-          </w:p>
-        </w:tc>
-        <w:tc>
-          <w:tcPr/>
-          <w:p>
-            <w:pPr>
-              <w:pStyle w:val="Compact"/>
-            </w:pPr>
-            <w:r>
-              <w:t xml:space="preserve">0.25</w:t>
-            </w:r>
-          </w:p>
-        </w:tc>
-        <w:tc>
-          <w:tcPr/>
-          <w:p>
-            <w:pPr>
-              <w:pStyle w:val="Compact"/>
-            </w:pPr>
-            <w:r>
-              <w:t xml:space="preserve">The flatness must be at most this fraction of the smallest expected sigma_tot.</w:t>
+              <w:t xml:space="preserve">PLATE_FLATNESS_MM</w:t>
+            </w:r>
+          </w:p>
+        </w:tc>
+        <w:tc>
+          <w:tcPr/>
+          <w:p>
+            <w:pPr>
+              <w:pStyle w:val="Compact"/>
+            </w:pPr>
+            <w:r>
+              <w:t xml:space="preserve">0.05</w:t>
+            </w:r>
+          </w:p>
+        </w:tc>
+        <w:tc>
+          <w:tcPr/>
+          <w:p>
+            <w:pPr>
+              <w:pStyle w:val="Compact"/>
+            </w:pPr>
+            <w:r>
+              <w:t xml:space="preserve">Required flatness of every plate.</w:t>
             </w:r>
           </w:p>
         </w:tc>
@@ -15248,29 +15296,29 @@
               <w:rPr>
                 <w:rStyle w:val="VerbatimChar"/>
               </w:rPr>
-              <w:t xml:space="preserve">GAP_SMALL_MM</w:t>
-            </w:r>
-          </w:p>
-        </w:tc>
-        <w:tc>
-          <w:tcPr/>
-          <w:p>
-            <w:pPr>
-              <w:pStyle w:val="Compact"/>
-            </w:pPr>
-            <w:r>
-              <w:t xml:space="preserve">15</w:t>
-            </w:r>
-          </w:p>
-        </w:tc>
-        <w:tc>
-          <w:tcPr/>
-          <w:p>
-            <w:pPr>
-              <w:pStyle w:val="Compact"/>
-            </w:pPr>
-            <w:r>
-              <w:t xml:space="preserve">Small front-to-back plate distance G.</w:t>
+              <w:t xml:space="preserve">PLATE_FLATNESS_SIGMA_FRACTION</w:t>
+            </w:r>
+          </w:p>
+        </w:tc>
+        <w:tc>
+          <w:tcPr/>
+          <w:p>
+            <w:pPr>
+              <w:pStyle w:val="Compact"/>
+            </w:pPr>
+            <w:r>
+              <w:t xml:space="preserve">0.25</w:t>
+            </w:r>
+          </w:p>
+        </w:tc>
+        <w:tc>
+          <w:tcPr/>
+          <w:p>
+            <w:pPr>
+              <w:pStyle w:val="Compact"/>
+            </w:pPr>
+            <w:r>
+              <w:t xml:space="preserve">The flatness must be at most this fraction of the smallest expected sigma_tot.</w:t>
             </w:r>
           </w:p>
         </w:tc>
@@ -15286,29 +15334,29 @@
               <w:rPr>
                 <w:rStyle w:val="VerbatimChar"/>
               </w:rPr>
-              <w:t xml:space="preserve">GAP_LARGE_MM</w:t>
-            </w:r>
-          </w:p>
-        </w:tc>
-        <w:tc>
-          <w:tcPr/>
-          <w:p>
-            <w:pPr>
-              <w:pStyle w:val="Compact"/>
-            </w:pPr>
-            <w:r>
-              <w:t xml:space="preserve">60</w:t>
-            </w:r>
-          </w:p>
-        </w:tc>
-        <w:tc>
-          <w:tcPr/>
-          <w:p>
-            <w:pPr>
-              <w:pStyle w:val="Compact"/>
-            </w:pPr>
-            <w:r>
-              <w:t xml:space="preserve">Large front-to-back plate distance G.</w:t>
+              <w:t xml:space="preserve">GAP_SMALL_MM</w:t>
+            </w:r>
+          </w:p>
+        </w:tc>
+        <w:tc>
+          <w:tcPr/>
+          <w:p>
+            <w:pPr>
+              <w:pStyle w:val="Compact"/>
+            </w:pPr>
+            <w:r>
+              <w:t xml:space="preserve">15</w:t>
+            </w:r>
+          </w:p>
+        </w:tc>
+        <w:tc>
+          <w:tcPr/>
+          <w:p>
+            <w:pPr>
+              <w:pStyle w:val="Compact"/>
+            </w:pPr>
+            <w:r>
+              <w:t xml:space="preserve">Small front-to-back plate distance G.</w:t>
             </w:r>
           </w:p>
         </w:tc>
@@ -15324,29 +15372,29 @@
               <w:rPr>
                 <w:rStyle w:val="VerbatimChar"/>
               </w:rPr>
-              <w:t xml:space="preserve">EDGE_SLANT_DEG</w:t>
-            </w:r>
-          </w:p>
-        </w:tc>
-        <w:tc>
-          <w:tcPr/>
-          <w:p>
-            <w:pPr>
-              <w:pStyle w:val="Compact"/>
-            </w:pPr>
-            <w:r>
-              <w:t xml:space="preserve">5</w:t>
-            </w:r>
-          </w:p>
-        </w:tc>
-        <w:tc>
-          <w:tcPr/>
-          <w:p>
-            <w:pPr>
-              <w:pStyle w:val="Compact"/>
-            </w:pPr>
-            <w:r>
-              <w:t xml:space="preserve">Rotation of the edge target in its own plane relative to the image axes (B-HV).</w:t>
+              <w:t xml:space="preserve">GAP_LARGE_MM</w:t>
+            </w:r>
+          </w:p>
+        </w:tc>
+        <w:tc>
+          <w:tcPr/>
+          <w:p>
+            <w:pPr>
+              <w:pStyle w:val="Compact"/>
+            </w:pPr>
+            <w:r>
+              <w:t xml:space="preserve">60</w:t>
+            </w:r>
+          </w:p>
+        </w:tc>
+        <w:tc>
+          <w:tcPr/>
+          <w:p>
+            <w:pPr>
+              <w:pStyle w:val="Compact"/>
+            </w:pPr>
+            <w:r>
+              <w:t xml:space="preserve">Large front-to-back plate distance G.</w:t>
             </w:r>
           </w:p>
         </w:tc>
@@ -15362,29 +15410,29 @@
               <w:rPr>
                 <w:rStyle w:val="VerbatimChar"/>
               </w:rPr>
-              <w:t xml:space="preserve">EDGE_SQUARE_SIZE_MM</w:t>
-            </w:r>
-          </w:p>
-        </w:tc>
-        <w:tc>
-          <w:tcPr/>
-          <w:p>
-            <w:pPr>
-              <w:pStyle w:val="Compact"/>
-            </w:pPr>
-            <w:r>
-              <w:t xml:space="preserve">160</w:t>
-            </w:r>
-          </w:p>
-        </w:tc>
-        <w:tc>
-          <w:tcPr/>
-          <w:p>
-            <w:pPr>
-              <w:pStyle w:val="Compact"/>
-            </w:pPr>
-            <w:r>
-              <w:t xml:space="preserve">Side of the raised square (T3a) and of the square window (T3b).</w:t>
+              <w:t xml:space="preserve">EDGE_SLANT_DEG</w:t>
+            </w:r>
+          </w:p>
+        </w:tc>
+        <w:tc>
+          <w:tcPr/>
+          <w:p>
+            <w:pPr>
+              <w:pStyle w:val="Compact"/>
+            </w:pPr>
+            <w:r>
+              <w:t xml:space="preserve">5</w:t>
+            </w:r>
+          </w:p>
+        </w:tc>
+        <w:tc>
+          <w:tcPr/>
+          <w:p>
+            <w:pPr>
+              <w:pStyle w:val="Compact"/>
+            </w:pPr>
+            <w:r>
+              <w:t xml:space="preserve">Rotation of the edge target in its own plane relative to the image axes (B-HV).</w:t>
             </w:r>
           </w:p>
         </w:tc>
@@ -15400,29 +15448,29 @@
               <w:rPr>
                 <w:rStyle w:val="VerbatimChar"/>
               </w:rPr>
-              <w:t xml:space="preserve">CHAMFER_MARGIN_DEG</w:t>
-            </w:r>
-          </w:p>
-        </w:tc>
-        <w:tc>
-          <w:tcPr/>
-          <w:p>
-            <w:pPr>
-              <w:pStyle w:val="Compact"/>
-            </w:pPr>
-            <w:r>
-              <w:t xml:space="preserve">10</w:t>
-            </w:r>
-          </w:p>
-        </w:tc>
-        <w:tc>
-          <w:tcPr/>
-          <w:p>
-            <w:pPr>
-              <w:pStyle w:val="Compact"/>
-            </w:pPr>
-            <w:r>
-              <w:t xml:space="preserve">Margin added to the worst-case ray angle in the bevel check (Section 3.3).</w:t>
+              <w:t xml:space="preserve">EDGE_SQUARE_SIZE_MM</w:t>
+            </w:r>
+          </w:p>
+        </w:tc>
+        <w:tc>
+          <w:tcPr/>
+          <w:p>
+            <w:pPr>
+              <w:pStyle w:val="Compact"/>
+            </w:pPr>
+            <w:r>
+              <w:t xml:space="preserve">160</w:t>
+            </w:r>
+          </w:p>
+        </w:tc>
+        <w:tc>
+          <w:tcPr/>
+          <w:p>
+            <w:pPr>
+              <w:pStyle w:val="Compact"/>
+            </w:pPr>
+            <w:r>
+              <w:t xml:space="preserve">Side of the raised square (T3a) and of the square window (T3b).</w:t>
             </w:r>
           </w:p>
         </w:tc>
@@ -15438,29 +15486,29 @@
               <w:rPr>
                 <w:rStyle w:val="VerbatimChar"/>
               </w:rPr>
-              <w:t xml:space="preserve">EDGE_LAND_MAX_MM</w:t>
-            </w:r>
-          </w:p>
-        </w:tc>
-        <w:tc>
-          <w:tcPr/>
-          <w:p>
-            <w:pPr>
-              <w:pStyle w:val="Compact"/>
-            </w:pPr>
-            <w:r>
-              <w:t xml:space="preserve">0.2</w:t>
-            </w:r>
-          </w:p>
-        </w:tc>
-        <w:tc>
-          <w:tcPr/>
-          <w:p>
-            <w:pPr>
-              <w:pStyle w:val="Compact"/>
-            </w:pPr>
-            <w:r>
-              <w:t xml:space="preserve">Maximum residual flat land at a knife edge.</w:t>
+              <w:t xml:space="preserve">CHAMFER_MARGIN_DEG</w:t>
+            </w:r>
+          </w:p>
+        </w:tc>
+        <w:tc>
+          <w:tcPr/>
+          <w:p>
+            <w:pPr>
+              <w:pStyle w:val="Compact"/>
+            </w:pPr>
+            <w:r>
+              <w:t xml:space="preserve">10</w:t>
+            </w:r>
+          </w:p>
+        </w:tc>
+        <w:tc>
+          <w:tcPr/>
+          <w:p>
+            <w:pPr>
+              <w:pStyle w:val="Compact"/>
+            </w:pPr>
+            <w:r>
+              <w:t xml:space="preserve">Margin added to the worst-case ray angle in the bevel check (Section 3.3).</w:t>
             </w:r>
           </w:p>
         </w:tc>
@@ -15476,29 +15524,29 @@
               <w:rPr>
                 <w:rStyle w:val="VerbatimChar"/>
               </w:rPr>
-              <w:t xml:space="preserve">FEATURE_LADDER_RATIO</w:t>
-            </w:r>
-          </w:p>
-        </w:tc>
-        <w:tc>
-          <w:tcPr/>
-          <w:p>
-            <w:pPr>
-              <w:pStyle w:val="Compact"/>
-            </w:pPr>
-            <w:r>
-              <w:t xml:space="preserve">2.828</w:t>
-            </w:r>
-          </w:p>
-        </w:tc>
-        <w:tc>
-          <w:tcPr/>
-          <w:p>
-            <w:pPr>
-              <w:pStyle w:val="Compact"/>
-            </w:pPr>
-            <w:r>
-              <w:t xml:space="preserve">Diameter ratio of successive disk and cutout features (a half-octave overlap in subtended pixels between neighbors, since one feature covers two octaves of D_px over the Z range).</w:t>
+              <w:t xml:space="preserve">EDGE_LAND_MAX_MM</w:t>
+            </w:r>
+          </w:p>
+        </w:tc>
+        <w:tc>
+          <w:tcPr/>
+          <w:p>
+            <w:pPr>
+              <w:pStyle w:val="Compact"/>
+            </w:pPr>
+            <w:r>
+              <w:t xml:space="preserve">0.2</w:t>
+            </w:r>
+          </w:p>
+        </w:tc>
+        <w:tc>
+          <w:tcPr/>
+          <w:p>
+            <w:pPr>
+              <w:pStyle w:val="Compact"/>
+            </w:pPr>
+            <w:r>
+              <w:t xml:space="preserve">Maximum residual flat land at a knife edge.</w:t>
             </w:r>
           </w:p>
         </w:tc>
@@ -15514,29 +15562,29 @@
               <w:rPr>
                 <w:rStyle w:val="VerbatimChar"/>
               </w:rPr>
-              <w:t xml:space="preserve">FEATURE_MIN_PX_AT_Z_MAX</w:t>
-            </w:r>
-          </w:p>
-        </w:tc>
-        <w:tc>
-          <w:tcPr/>
-          <w:p>
-            <w:pPr>
-              <w:pStyle w:val="Compact"/>
-            </w:pPr>
-            <w:r>
-              <w:t xml:space="preserve">3</w:t>
-            </w:r>
-          </w:p>
-        </w:tc>
-        <w:tc>
-          <w:tcPr/>
-          <w:p>
-            <w:pPr>
-              <w:pStyle w:val="Compact"/>
-            </w:pPr>
-            <w:r>
-              <w:t xml:space="preserve">Subtended size, in pixels at Z_MAX, of the smallest feature.</w:t>
+              <w:t xml:space="preserve">FEATURE_LADDER_RATIO</w:t>
+            </w:r>
+          </w:p>
+        </w:tc>
+        <w:tc>
+          <w:tcPr/>
+          <w:p>
+            <w:pPr>
+              <w:pStyle w:val="Compact"/>
+            </w:pPr>
+            <w:r>
+              <w:t xml:space="preserve">2.828</w:t>
+            </w:r>
+          </w:p>
+        </w:tc>
+        <w:tc>
+          <w:tcPr/>
+          <w:p>
+            <w:pPr>
+              <w:pStyle w:val="Compact"/>
+            </w:pPr>
+            <w:r>
+              <w:t xml:space="preserve">Diameter ratio of successive disk and cutout features (a half-octave overlap in subtended pixels between neighbors, since one feature covers two octaves of D_px over the Z range).</w:t>
             </w:r>
           </w:p>
         </w:tc>
@@ -15552,7 +15600,7 @@
               <w:rPr>
                 <w:rStyle w:val="VerbatimChar"/>
               </w:rPr>
-              <w:t xml:space="preserve">FEATURE_COUNT</w:t>
+              <w:t xml:space="preserve">FEATURE_MIN_PX_AT_Z_MAX</w:t>
             </w:r>
           </w:p>
         </w:tc>
@@ -15574,7 +15622,7 @@
               <w:pStyle w:val="Compact"/>
             </w:pPr>
             <w:r>
-              <w:t xml:space="preserve">Features per disk plate and per cutout plate.</w:t>
+              <w:t xml:space="preserve">Subtended size, in pixels at Z_MAX, of the smallest feature.</w:t>
             </w:r>
           </w:p>
         </w:tc>
@@ -15590,7 +15638,7 @@
               <w:rPr>
                 <w:rStyle w:val="VerbatimChar"/>
               </w:rPr>
-              <w:t xml:space="preserve">BLANK_SITES_PER_PLATE</w:t>
+              <w:t xml:space="preserve">FEATURE_COUNT</w:t>
             </w:r>
           </w:p>
         </w:tc>
@@ -15612,7 +15660,7 @@
               <w:pStyle w:val="Compact"/>
             </w:pPr>
             <w:r>
-              <w:t xml:space="preserve">Blank sites per plate (the guess rate gamma of the detection fit). Blank site i serves feature i and is sized to that feature’s search window at Z_MAX, D_i + 2 DETECTION_WINDOW_MARGIN_PX p(Z_MAX); at most FEATURE_COUNT.</w:t>
+              <w:t xml:space="preserve">Features per disk plate and per cutout plate.</w:t>
             </w:r>
           </w:p>
         </w:tc>
@@ -15628,29 +15676,29 @@
               <w:rPr>
                 <w:rStyle w:val="VerbatimChar"/>
               </w:rPr>
-              <w:t xml:space="preserve">POST_SITES_PER_PLATE</w:t>
-            </w:r>
-          </w:p>
-        </w:tc>
-        <w:tc>
-          <w:tcPr/>
-          <w:p>
-            <w:pPr>
-              <w:pStyle w:val="Compact"/>
-            </w:pPr>
-            <w:r>
-              <w:t xml:space="preserve">1</w:t>
-            </w:r>
-          </w:p>
-        </w:tc>
-        <w:tc>
-          <w:tcPr/>
-          <w:p>
-            <w:pPr>
-              <w:pStyle w:val="Compact"/>
-            </w:pPr>
-            <w:r>
-              <w:t xml:space="preserve">Post-only sites per disk plate (the post check: a bare post must not be detected).</w:t>
+              <w:t xml:space="preserve">BLANK_SITES_PER_PLATE</w:t>
+            </w:r>
+          </w:p>
+        </w:tc>
+        <w:tc>
+          <w:tcPr/>
+          <w:p>
+            <w:pPr>
+              <w:pStyle w:val="Compact"/>
+            </w:pPr>
+            <w:r>
+              <w:t xml:space="preserve">3</w:t>
+            </w:r>
+          </w:p>
+        </w:tc>
+        <w:tc>
+          <w:tcPr/>
+          <w:p>
+            <w:pPr>
+              <w:pStyle w:val="Compact"/>
+            </w:pPr>
+            <w:r>
+              <w:t xml:space="preserve">Blank sites per plate (the guess rate gamma of the detection fit). Blank site i serves feature i and is sized to that feature’s search window at Z_MAX, D_i + 2 DETECTION_WINDOW_MARGIN_PX p(Z_MAX); at most FEATURE_COUNT.</w:t>
             </w:r>
           </w:p>
         </w:tc>
@@ -15666,29 +15714,29 @@
               <w:rPr>
                 <w:rStyle w:val="VerbatimChar"/>
               </w:rPr>
-              <w:t xml:space="preserve">FEATURE_ISOLATION_PX</w:t>
-            </w:r>
-          </w:p>
-        </w:tc>
-        <w:tc>
-          <w:tcPr/>
-          <w:p>
-            <w:pPr>
-              <w:pStyle w:val="Compact"/>
-            </w:pPr>
-            <w:r>
-              <w:t xml:space="preserve">30</w:t>
-            </w:r>
-          </w:p>
-        </w:tc>
-        <w:tc>
-          <w:tcPr/>
-          <w:p>
-            <w:pPr>
-              <w:pStyle w:val="Compact"/>
-            </w:pPr>
-            <w:r>
-              <w:t xml:space="preserve">Minimum edge-to-edge spacing between features, pixels at Z_MAX (evaluated at the far station so that neighbors stay separated there, where a pixel covers the most millimeters). Applies edge to edge between every pair of sites of a plate, in both directions (along a row and between rows).</w:t>
+              <w:t xml:space="preserve">POST_SITES_PER_PLATE</w:t>
+            </w:r>
+          </w:p>
+        </w:tc>
+        <w:tc>
+          <w:tcPr/>
+          <w:p>
+            <w:pPr>
+              <w:pStyle w:val="Compact"/>
+            </w:pPr>
+            <w:r>
+              <w:t xml:space="preserve">1</w:t>
+            </w:r>
+          </w:p>
+        </w:tc>
+        <w:tc>
+          <w:tcPr/>
+          <w:p>
+            <w:pPr>
+              <w:pStyle w:val="Compact"/>
+            </w:pPr>
+            <w:r>
+              <w:t xml:space="preserve">Post-only sites per disk plate (the post check: a bare post must not be detected).</w:t>
             </w:r>
           </w:p>
         </w:tc>
@@ -15704,29 +15752,29 @@
               <w:rPr>
                 <w:rStyle w:val="VerbatimChar"/>
               </w:rPr>
-              <w:t xml:space="preserve">FEATURE_PLATE_MARGIN_PX</w:t>
-            </w:r>
-          </w:p>
-        </w:tc>
-        <w:tc>
-          <w:tcPr/>
-          <w:p>
-            <w:pPr>
-              <w:pStyle w:val="Compact"/>
-            </w:pPr>
-            <w:r>
-              <w:t xml:space="preserve">8</w:t>
-            </w:r>
-          </w:p>
-        </w:tc>
-        <w:tc>
-          <w:tcPr/>
-          <w:p>
-            <w:pPr>
-              <w:pStyle w:val="Compact"/>
-            </w:pPr>
-            <w:r>
-              <w:t xml:space="preserve">Front-plate margin beyond the outermost sites of a disk or cutout plate, pixels at Z_MAX (equal to the boundary band BOUNDARY_BAND_HALF_WIDTH_PX, so that the analysis band of an outer cutout edge lies on front material at the far station). The plate (sites plus margin) must fit the field of view at Z_MIN with the phase-jitter span and the boundary band on every side; make_standard_target_set raises an error when it does not.</w:t>
+              <w:t xml:space="preserve">FEATURE_ISOLATION_PX</w:t>
+            </w:r>
+          </w:p>
+        </w:tc>
+        <w:tc>
+          <w:tcPr/>
+          <w:p>
+            <w:pPr>
+              <w:pStyle w:val="Compact"/>
+            </w:pPr>
+            <w:r>
+              <w:t xml:space="preserve">30</w:t>
+            </w:r>
+          </w:p>
+        </w:tc>
+        <w:tc>
+          <w:tcPr/>
+          <w:p>
+            <w:pPr>
+              <w:pStyle w:val="Compact"/>
+            </w:pPr>
+            <w:r>
+              <w:t xml:space="preserve">Minimum edge-to-edge spacing between features, pixels at Z_MAX (evaluated at the far station so that neighbors stay separated there, where a pixel covers the most millimeters). Applies edge to edge between every pair of sites of a plate, in both directions (along a row and between rows).</w:t>
             </w:r>
           </w:p>
         </w:tc>
@@ -15742,29 +15790,29 @@
               <w:rPr>
                 <w:rStyle w:val="VerbatimChar"/>
               </w:rPr>
-              <w:t xml:space="preserve">EXPECTED_D0_PX</w:t>
-            </w:r>
-          </w:p>
-        </w:tc>
-        <w:tc>
-          <w:tcPr/>
-          <w:p>
-            <w:pPr>
-              <w:pStyle w:val="Compact"/>
-            </w:pPr>
-            <w:r>
-              <w:t xml:space="preserve">7</w:t>
-            </w:r>
-          </w:p>
-        </w:tc>
-        <w:tc>
-          <w:tcPr/>
-          <w:p>
-            <w:pPr>
-              <w:pStyle w:val="Compact"/>
-            </w:pPr>
-            <w:r>
-              <w:t xml:space="preserve">Expected minimum detectable size D_0 in pixels, from the detectability model of Section 3.2 (about 40 pixels of area, a diameter of 7 px), used before fabrication to size the disk support posts. Not a measured value: Analysis D replaces it with the predicted D_0.</w:t>
+              <w:t xml:space="preserve">FEATURE_PLATE_MARGIN_PX</w:t>
+            </w:r>
+          </w:p>
+        </w:tc>
+        <w:tc>
+          <w:tcPr/>
+          <w:p>
+            <w:pPr>
+              <w:pStyle w:val="Compact"/>
+            </w:pPr>
+            <w:r>
+              <w:t xml:space="preserve">8</w:t>
+            </w:r>
+          </w:p>
+        </w:tc>
+        <w:tc>
+          <w:tcPr/>
+          <w:p>
+            <w:pPr>
+              <w:pStyle w:val="Compact"/>
+            </w:pPr>
+            <w:r>
+              <w:t xml:space="preserve">Front-plate margin beyond the outermost sites of a disk or cutout plate, pixels at Z_MAX (equal to the boundary band BOUNDARY_BAND_HALF_WIDTH_PX, so that the analysis band of an outer cutout edge lies on front material at the far station). The plate (sites plus margin) must fit the field of view at Z_MIN with the phase-jitter span and the boundary band on every side; make_standard_target_set raises an error when it does not.</w:t>
             </w:r>
           </w:p>
         </w:tc>
@@ -15780,38 +15828,29 @@
               <w:rPr>
                 <w:rStyle w:val="VerbatimChar"/>
               </w:rPr>
-              <w:t xml:space="preserve">POST_DIAMETER_FRACTION_OF_D0</w:t>
-            </w:r>
-          </w:p>
-        </w:tc>
-        <w:tc>
-          <w:tcPr/>
-          <w:p>
-            <w:pPr>
-              <w:pStyle w:val="Compact"/>
-            </w:pPr>
-            <w:r>
-              <w:t xml:space="preserve">0.5</w:t>
-            </w:r>
-          </w:p>
-        </w:tc>
-        <w:tc>
-          <w:tcPr/>
-          <w:p>
-            <w:pPr>
-              <w:pStyle w:val="Compact"/>
-            </w:pPr>
-            <w:r>
-              <w:t xml:space="preserve">Rule for the disk support posts: a post must be thinner than this fraction of the expected D_0 (the post check of Section 8, Step 1 confirms that a bare post is not detected). The planned post diameter is post_diameter_fraction_of_d0 x expected_d0_px x p(Z_MIN) (:meth:</w:t>
-            </w:r>
-            <w:r>
-              <w:rPr>
-                <w:rStyle w:val="VerbatimChar"/>
-              </w:rPr>
-              <w:t xml:space="preserve">post_diameter_mm</w:t>
-            </w:r>
-            <w:r>
-              <w:t xml:space="preserve">: about 2 mm at the indicative geometry).</w:t>
+              <w:t xml:space="preserve">EXPECTED_D0_PX</w:t>
+            </w:r>
+          </w:p>
+        </w:tc>
+        <w:tc>
+          <w:tcPr/>
+          <w:p>
+            <w:pPr>
+              <w:pStyle w:val="Compact"/>
+            </w:pPr>
+            <w:r>
+              <w:t xml:space="preserve">7</w:t>
+            </w:r>
+          </w:p>
+        </w:tc>
+        <w:tc>
+          <w:tcPr/>
+          <w:p>
+            <w:pPr>
+              <w:pStyle w:val="Compact"/>
+            </w:pPr>
+            <w:r>
+              <w:t xml:space="preserve">Expected minimum detectable size D_0 in pixels, from the detectability model of Section 3.2 (about 40 pixels of area, a diameter of 7 px), used before fabrication to size the disk support posts. Not a measured value: Analysis D replaces it with the predicted D_0.</w:t>
             </w:r>
           </w:p>
         </w:tc>
@@ -15827,7 +15866,7 @@
               <w:rPr>
                 <w:rStyle w:val="VerbatimChar"/>
               </w:rPr>
-              <w:t xml:space="preserve">FRAME_CHECK_PX</w:t>
+              <w:t xml:space="preserve">POST_DIAMETER_FRACTION_OF_D0</w:t>
             </w:r>
           </w:p>
         </w:tc>
@@ -15849,7 +15888,16 @@
               <w:pStyle w:val="Compact"/>
             </w:pPr>
             <w:r>
-              <w:t xml:space="preserve">IR-edge to depth-discontinuity agreement required in Step 4.5.</w:t>
+              <w:t xml:space="preserve">Rule for the disk support posts: a post must be thinner than this fraction of the expected D_0 (the post check of Section 8, Step 1 confirms that a bare post is not detected). The planned post diameter is post_diameter_fraction_of_d0 x expected_d0_px x p(Z_MIN) (:meth:</w:t>
+            </w:r>
+            <w:r>
+              <w:rPr>
+                <w:rStyle w:val="VerbatimChar"/>
+              </w:rPr>
+              <w:t xml:space="preserve">post_diameter_mm</w:t>
+            </w:r>
+            <w:r>
+              <w:t xml:space="preserve">: about 2 mm at the indicative geometry).</w:t>
             </w:r>
           </w:p>
         </w:tc>
@@ -15865,29 +15913,29 @@
               <w:rPr>
                 <w:rStyle w:val="VerbatimChar"/>
               </w:rPr>
-              <w:t xml:space="preserve">REGISTRATION_POSES</w:t>
-            </w:r>
-          </w:p>
-        </w:tc>
-        <w:tc>
-          <w:tcPr/>
-          <w:p>
-            <w:pPr>
-              <w:pStyle w:val="Compact"/>
-            </w:pPr>
-            <w:r>
-              <w:t xml:space="preserve">30</w:t>
-            </w:r>
-          </w:p>
-        </w:tc>
-        <w:tc>
-          <w:tcPr/>
-          <w:p>
-            <w:pPr>
-              <w:pStyle w:val="Compact"/>
-            </w:pPr>
-            <w:r>
-              <w:t xml:space="preserve">Hand-eye poses spanning the volume (Section 4, Step 6).</w:t>
+              <w:t xml:space="preserve">FRAME_CHECK_PX</w:t>
+            </w:r>
+          </w:p>
+        </w:tc>
+        <w:tc>
+          <w:tcPr/>
+          <w:p>
+            <w:pPr>
+              <w:pStyle w:val="Compact"/>
+            </w:pPr>
+            <w:r>
+              <w:t xml:space="preserve">0.5</w:t>
+            </w:r>
+          </w:p>
+        </w:tc>
+        <w:tc>
+          <w:tcPr/>
+          <w:p>
+            <w:pPr>
+              <w:pStyle w:val="Compact"/>
+            </w:pPr>
+            <w:r>
+              <w:t xml:space="preserve">IR-edge to depth-discontinuity agreement required in Step 4.5.</w:t>
             </w:r>
           </w:p>
         </w:tc>
@@ -15903,29 +15951,29 @@
               <w:rPr>
                 <w:rStyle w:val="VerbatimChar"/>
               </w:rPr>
-              <w:t xml:space="preserve">REGISTRATION_TILT_RANGE_DEG</w:t>
-            </w:r>
-          </w:p>
-        </w:tc>
-        <w:tc>
-          <w:tcPr/>
-          <w:p>
-            <w:pPr>
-              <w:pStyle w:val="Compact"/>
-            </w:pPr>
-            <w:r>
-              <w:t xml:space="preserve">20</w:t>
-            </w:r>
-          </w:p>
-        </w:tc>
-        <w:tc>
-          <w:tcPr/>
-          <w:p>
-            <w:pPr>
-              <w:pStyle w:val="Compact"/>
-            </w:pPr>
-            <w:r>
-              <w:t xml:space="preserve">Half range of the registration tilts about H and V (+/-).</w:t>
+              <w:t xml:space="preserve">REGISTRATION_POSES</w:t>
+            </w:r>
+          </w:p>
+        </w:tc>
+        <w:tc>
+          <w:tcPr/>
+          <w:p>
+            <w:pPr>
+              <w:pStyle w:val="Compact"/>
+            </w:pPr>
+            <w:r>
+              <w:t xml:space="preserve">30</w:t>
+            </w:r>
+          </w:p>
+        </w:tc>
+        <w:tc>
+          <w:tcPr/>
+          <w:p>
+            <w:pPr>
+              <w:pStyle w:val="Compact"/>
+            </w:pPr>
+            <w:r>
+              <w:t xml:space="preserve">Hand-eye poses spanning the volume (Section 4, Step 6).</w:t>
             </w:r>
           </w:p>
         </w:tc>
@@ -15941,29 +15989,29 @@
               <w:rPr>
                 <w:rStyle w:val="VerbatimChar"/>
               </w:rPr>
-              <w:t xml:space="preserve">REGISTRATION_RESIDUAL_ACCEPT_MM</w:t>
-            </w:r>
-          </w:p>
-        </w:tc>
-        <w:tc>
-          <w:tcPr/>
-          <w:p>
-            <w:pPr>
-              <w:pStyle w:val="Compact"/>
-            </w:pPr>
-            <w:r>
-              <w:t xml:space="preserve">0.15</w:t>
-            </w:r>
-          </w:p>
-        </w:tc>
-        <w:tc>
-          <w:tcPr/>
-          <w:p>
-            <w:pPr>
-              <w:pStyle w:val="Compact"/>
-            </w:pPr>
-            <w:r>
-              <w:t xml:space="preserve">Acceptance limit of the registration residual, mm RMS.</w:t>
+              <w:t xml:space="preserve">REGISTRATION_TILT_RANGE_DEG</w:t>
+            </w:r>
+          </w:p>
+        </w:tc>
+        <w:tc>
+          <w:tcPr/>
+          <w:p>
+            <w:pPr>
+              <w:pStyle w:val="Compact"/>
+            </w:pPr>
+            <w:r>
+              <w:t xml:space="preserve">20</w:t>
+            </w:r>
+          </w:p>
+        </w:tc>
+        <w:tc>
+          <w:tcPr/>
+          <w:p>
+            <w:pPr>
+              <w:pStyle w:val="Compact"/>
+            </w:pPr>
+            <w:r>
+              <w:t xml:space="preserve">Half range of the registration tilts about H and V (+/-).</w:t>
             </w:r>
           </w:p>
         </w:tc>
@@ -15979,29 +16027,29 @@
               <w:rPr>
                 <w:rStyle w:val="VerbatimChar"/>
               </w:rPr>
-              <w:t xml:space="preserve">MOUNT_CHECK_DEPTH_MM</w:t>
-            </w:r>
-          </w:p>
-        </w:tc>
-        <w:tc>
-          <w:tcPr/>
-          <w:p>
-            <w:pPr>
-              <w:pStyle w:val="Compact"/>
-            </w:pPr>
-            <w:r>
-              <w:t xml:space="preserve">800</w:t>
-            </w:r>
-          </w:p>
-        </w:tc>
-        <w:tc>
-          <w:tcPr/>
-          <w:p>
-            <w:pPr>
-              <w:pStyle w:val="Compact"/>
-            </w:pPr>
-            <w:r>
-              <w:t xml:space="preserve">Depth of the once-per-mount plane-fit check (Section 4, Step 8).</w:t>
+              <w:t xml:space="preserve">REGISTRATION_RESIDUAL_ACCEPT_MM</w:t>
+            </w:r>
+          </w:p>
+        </w:tc>
+        <w:tc>
+          <w:tcPr/>
+          <w:p>
+            <w:pPr>
+              <w:pStyle w:val="Compact"/>
+            </w:pPr>
+            <w:r>
+              <w:t xml:space="preserve">0.15</w:t>
+            </w:r>
+          </w:p>
+        </w:tc>
+        <w:tc>
+          <w:tcPr/>
+          <w:p>
+            <w:pPr>
+              <w:pStyle w:val="Compact"/>
+            </w:pPr>
+            <w:r>
+              <w:t xml:space="preserve">Acceptance limit of the registration residual, mm RMS.</w:t>
             </w:r>
           </w:p>
         </w:tc>
@@ -16017,6 +16065,44 @@
               <w:rPr>
                 <w:rStyle w:val="VerbatimChar"/>
               </w:rPr>
+              <w:t xml:space="preserve">MOUNT_CHECK_DEPTH_MM</w:t>
+            </w:r>
+          </w:p>
+        </w:tc>
+        <w:tc>
+          <w:tcPr/>
+          <w:p>
+            <w:pPr>
+              <w:pStyle w:val="Compact"/>
+            </w:pPr>
+            <w:r>
+              <w:t xml:space="preserve">800</w:t>
+            </w:r>
+          </w:p>
+        </w:tc>
+        <w:tc>
+          <w:tcPr/>
+          <w:p>
+            <w:pPr>
+              <w:pStyle w:val="Compact"/>
+            </w:pPr>
+            <w:r>
+              <w:t xml:space="preserve">Depth of the once-per-mount plane-fit check (Section 4, Step 8).</w:t>
+            </w:r>
+          </w:p>
+        </w:tc>
+      </w:tr>
+      <w:tr>
+        <w:tc>
+          <w:tcPr/>
+          <w:p>
+            <w:pPr>
+              <w:pStyle w:val="Compact"/>
+            </w:pPr>
+            <w:r>
+              <w:rPr>
+                <w:rStyle w:val="VerbatimChar"/>
+              </w:rPr>
               <w:t xml:space="preserve">MOUNT_TILT_TOLERANCE_DEG</w:t>
             </w:r>
           </w:p>
@@ -16039,7 +16125,7 @@
               <w:pStyle w:val="Compact"/>
             </w:pPr>
             <w:r>
-              <w:t xml:space="preserve">Largest tilt difference between a mounted target’s fitted front plane and the registered pose that the mount check of Step 4.8 accepts (dagger: 0.05 degrees moves a plate edge 200 mm from center by about 0.17 mm). Z is held to registration_residual_accept_mm and H, V to frame_check_px.</w:t>
+              <w:t xml:space="preserve">Largest tilt difference between a mounted target’s fitted front plane and the registered pose that the mount check of Step 4.8 accepts (dagger: 0.05 degrees moves a plate edge 100 mm from center (the half-width of the T2 board) by about 0.09 mm). Z is held to registration_residual_accept_mm and H, V to frame_check_px.</w:t>
             </w:r>
           </w:p>
         </w:tc>
@@ -16556,7 +16642,7 @@
               <w:jc w:val="right"/>
             </w:pPr>
             <w:r>
-              <w:t xml:space="preserve">2064</w:t>
+              <w:t xml:space="preserve">2135</w:t>
             </w:r>
           </w:p>
         </w:tc>
@@ -17624,7 +17710,7 @@
               <w:jc w:val="right"/>
             </w:pPr>
             <w:r>
-              <w:t xml:space="preserve">793</w:t>
+              <w:t xml:space="preserve">884</w:t>
             </w:r>
           </w:p>
         </w:tc>
@@ -18008,7 +18094,7 @@
               <w:jc w:val="right"/>
             </w:pPr>
             <w:r>
-              <w:t xml:space="preserve">698</w:t>
+              <w:t xml:space="preserve">705</w:t>
             </w:r>
           </w:p>
         </w:tc>

</xml_diff>